<commit_message>
add( source code link)
</commit_message>
<xml_diff>
--- a/docs/Описание_MDMTSP_КТ2.docx
+++ b/docs/Описание_MDMTSP_КТ2.docx
@@ -151,7 +151,25 @@
           <w:szCs w:val="28"/>
           <w:lang w:val="ru-RU"/>
         </w:rPr>
-        <w:t>: разработать и исследовать эффективные и масштабируемые методы оптимизации маршрутов для прикладной задачи нескольких коммивояжёров с несколькими депо (</w:t>
+        <w:t xml:space="preserve">: разработать и исследовать эффективные методы оптимизации маршрутов для прикладной </w:t>
+      </w:r>
+      <w:r>
+        <w:rPr>
+          <w:rFonts w:ascii="Times New Roman" w:hAnsi="Times New Roman" w:cs="Times New Roman"/>
+          <w:sz w:val="28"/>
+          <w:szCs w:val="28"/>
+          <w:lang w:val="ru-RU"/>
+        </w:rPr>
+        <w:t xml:space="preserve">алгоритмической </w:t>
+      </w:r>
+      <w:r>
+        <w:rPr>
+          <w:rFonts w:ascii="Times New Roman" w:hAnsi="Times New Roman" w:cs="Times New Roman"/>
+          <w:sz w:val="28"/>
+          <w:szCs w:val="28"/>
+          <w:lang w:val="ru-RU"/>
+        </w:rPr>
+        <w:t>задачи нескольких коммивояжёров с несколькими депо (</w:t>
       </w:r>
       <w:r>
         <w:rPr>
@@ -168,7 +186,43 @@
           <w:szCs w:val="28"/>
           <w:lang w:val="ru-RU"/>
         </w:rPr>
-        <w:t>), обеспечивающие высокое качество решений при работе с данными большой размерности.</w:t>
+        <w:t>), обеспечивающие высок</w:t>
+      </w:r>
+      <w:r>
+        <w:rPr>
+          <w:rFonts w:ascii="Times New Roman" w:hAnsi="Times New Roman" w:cs="Times New Roman"/>
+          <w:sz w:val="28"/>
+          <w:szCs w:val="28"/>
+          <w:lang w:val="ru-RU"/>
+        </w:rPr>
+        <w:t>ую</w:t>
+      </w:r>
+      <w:r>
+        <w:rPr>
+          <w:rFonts w:ascii="Times New Roman" w:hAnsi="Times New Roman" w:cs="Times New Roman"/>
+          <w:sz w:val="28"/>
+          <w:szCs w:val="28"/>
+          <w:lang w:val="ru-RU"/>
+        </w:rPr>
+        <w:t xml:space="preserve"> </w:t>
+      </w:r>
+      <w:r>
+        <w:rPr>
+          <w:rFonts w:ascii="Times New Roman" w:hAnsi="Times New Roman" w:cs="Times New Roman"/>
+          <w:sz w:val="28"/>
+          <w:szCs w:val="28"/>
+          <w:lang w:val="ru-RU"/>
+        </w:rPr>
+        <w:t>точность</w:t>
+      </w:r>
+      <w:r>
+        <w:rPr>
+          <w:rFonts w:ascii="Times New Roman" w:hAnsi="Times New Roman" w:cs="Times New Roman"/>
+          <w:sz w:val="28"/>
+          <w:szCs w:val="28"/>
+          <w:lang w:val="ru-RU"/>
+        </w:rPr>
+        <w:t xml:space="preserve"> решений при работе с данными большой размерности.</w:t>
       </w:r>
     </w:p>
     <w:p>
@@ -230,7 +284,25 @@
           <w:szCs w:val="28"/>
           <w:lang w:val="ru-RU"/>
         </w:rPr>
-        <w:t>интерес к современным алгоритмам комбинаторной оптимизации и их применению к сложным прикладным задачам на графах. Задача нескольких коммивояжёров с несколькими депо (</w:t>
+        <w:t xml:space="preserve">интерес к </w:t>
+      </w:r>
+      <w:r>
+        <w:rPr>
+          <w:rFonts w:ascii="Times New Roman" w:hAnsi="Times New Roman" w:cs="Times New Roman"/>
+          <w:sz w:val="28"/>
+          <w:szCs w:val="28"/>
+          <w:lang w:val="ru-RU"/>
+        </w:rPr>
+        <w:t xml:space="preserve">эвристическим и прочим </w:t>
+      </w:r>
+      <w:r>
+        <w:rPr>
+          <w:rFonts w:ascii="Times New Roman" w:hAnsi="Times New Roman" w:cs="Times New Roman"/>
+          <w:sz w:val="28"/>
+          <w:szCs w:val="28"/>
+          <w:lang w:val="ru-RU"/>
+        </w:rPr>
+        <w:t>алгоритмам оптимизации. Задача нескольких коммивояжёров с несколькими депо (</w:t>
       </w:r>
       <w:r>
         <w:rPr>
@@ -247,7 +319,88 @@
           <w:szCs w:val="28"/>
           <w:lang w:val="ru-RU"/>
         </w:rPr>
-        <w:t>) представляет собой естественное и при этом существенно усложнённое обобщение классической задачи коммивояжёра, в котором сочетаются вопросы маршрутизации, распределения ресурсов и балансировки нагрузки. Работа над данной задачей позволяет на практике исследовать поведение продвинутых эвристических методов, в условиях высокой размерности и сложной структуры ограничений, а также получить опыт проектирования и экспериментальной оценки масштабируемых алгоритмов оптимизации для реальных задач маршрутизации.</w:t>
+        <w:t>) представляет собой</w:t>
+      </w:r>
+      <w:r>
+        <w:rPr>
+          <w:rFonts w:ascii="Times New Roman" w:hAnsi="Times New Roman" w:cs="Times New Roman"/>
+          <w:sz w:val="28"/>
+          <w:szCs w:val="28"/>
+          <w:lang w:val="ru-RU"/>
+        </w:rPr>
+        <w:t xml:space="preserve"> </w:t>
+      </w:r>
+      <w:r>
+        <w:rPr>
+          <w:rFonts w:ascii="Times New Roman" w:hAnsi="Times New Roman" w:cs="Times New Roman"/>
+          <w:sz w:val="28"/>
+          <w:szCs w:val="28"/>
+          <w:lang w:val="ru-RU"/>
+        </w:rPr>
+        <w:t xml:space="preserve">существенно усложнённое обобщение классической задачи коммивояжёра, в котором сочетаются вопросы маршрутизации, распределения ресурсов и балансировки нагрузки. Работа над </w:t>
+      </w:r>
+      <w:r>
+        <w:rPr>
+          <w:rFonts w:ascii="Times New Roman" w:hAnsi="Times New Roman" w:cs="Times New Roman"/>
+          <w:sz w:val="28"/>
+          <w:szCs w:val="28"/>
+          <w:lang w:val="ru-RU"/>
+        </w:rPr>
+        <w:t>оптимизацией</w:t>
+      </w:r>
+      <w:r>
+        <w:rPr>
+          <w:rFonts w:ascii="Times New Roman" w:hAnsi="Times New Roman" w:cs="Times New Roman"/>
+          <w:sz w:val="28"/>
+          <w:szCs w:val="28"/>
+          <w:lang w:val="ru-RU"/>
+        </w:rPr>
+        <w:t xml:space="preserve"> задач</w:t>
+      </w:r>
+      <w:r>
+        <w:rPr>
+          <w:rFonts w:ascii="Times New Roman" w:hAnsi="Times New Roman" w:cs="Times New Roman"/>
+          <w:sz w:val="28"/>
+          <w:szCs w:val="28"/>
+          <w:lang w:val="ru-RU"/>
+        </w:rPr>
+        <w:t>и</w:t>
+      </w:r>
+      <w:r>
+        <w:rPr>
+          <w:rFonts w:ascii="Times New Roman" w:hAnsi="Times New Roman" w:cs="Times New Roman"/>
+          <w:sz w:val="28"/>
+          <w:szCs w:val="28"/>
+          <w:lang w:val="ru-RU"/>
+        </w:rPr>
+        <w:t xml:space="preserve"> позволяет на практике исследовать поведение продвинутых эвристических методов, </w:t>
+      </w:r>
+      <w:r>
+        <w:rPr>
+          <w:rFonts w:ascii="Times New Roman" w:hAnsi="Times New Roman" w:cs="Times New Roman"/>
+          <w:sz w:val="28"/>
+          <w:szCs w:val="28"/>
+          <w:lang w:val="ru-RU"/>
+        </w:rPr>
+        <w:t>на данных</w:t>
+      </w:r>
+      <w:r>
+        <w:rPr>
+          <w:rFonts w:ascii="Times New Roman" w:hAnsi="Times New Roman" w:cs="Times New Roman"/>
+          <w:sz w:val="28"/>
+          <w:szCs w:val="28"/>
+          <w:lang w:val="ru-RU"/>
+        </w:rPr>
+        <w:t xml:space="preserve"> высокой размерности, а также получить опыт проектирования и экспериментальной оценки алгоритмов оптимизации</w:t>
+      </w:r>
+      <w:r>
+        <w:rPr>
+          <w:rFonts w:ascii="Times New Roman" w:hAnsi="Times New Roman" w:cs="Times New Roman"/>
+          <w:sz w:val="28"/>
+          <w:szCs w:val="28"/>
+          <w:lang w:val="ru-RU"/>
+        </w:rPr>
+        <w:t>, решающих любые другие задачи.</w:t>
       </w:r>
     </w:p>
     <w:p>
@@ -421,6 +574,17 @@
           <w:lang w:val="ru-RU"/>
         </w:rPr>
       </w:pPr>
+    </w:p>
+    <w:p>
+      <w:pPr>
+        <w:jc w:val="both"/>
+        <w:rPr>
+          <w:rFonts w:ascii="Times New Roman" w:hAnsi="Times New Roman" w:cs="Times New Roman"/>
+          <w:sz w:val="28"/>
+          <w:szCs w:val="28"/>
+          <w:lang w:val="ru-RU"/>
+        </w:rPr>
+      </w:pPr>
       <w:r>
         <w:rPr>
           <w:rFonts w:ascii="Times New Roman" w:hAnsi="Times New Roman" w:cs="Times New Roman"/>
@@ -440,9 +604,8 @@
           <w:szCs w:val="28"/>
           <w:lang w:val="ru-RU"/>
         </w:rPr>
-        <w:t xml:space="preserve"> использование комбинированных эвристических подходов к задаче нескольких коммивояжёров с несколькими депо, основанных на разделении задачи на этапы распределения, маршрутизации и последующего локального улучшения с </w:t>
+        <w:t xml:space="preserve"> </w:t>
       </w:r>
-      <w:proofErr w:type="spellStart"/>
       <w:r>
         <w:rPr>
           <w:rFonts w:ascii="Times New Roman" w:hAnsi="Times New Roman" w:cs="Times New Roman"/>
@@ -450,9 +613,8 @@
           <w:szCs w:val="28"/>
           <w:lang w:val="ru-RU"/>
         </w:rPr>
-        <w:t>межмаршрутными</w:t>
+        <w:t>п</w:t>
       </w:r>
-      <w:proofErr w:type="spellEnd"/>
       <w:r>
         <w:rPr>
           <w:rFonts w:ascii="Times New Roman" w:hAnsi="Times New Roman" w:cs="Times New Roman"/>
@@ -460,7 +622,24 @@
           <w:szCs w:val="28"/>
           <w:lang w:val="ru-RU"/>
         </w:rPr>
-        <w:t xml:space="preserve"> операторами, позволяет существенно повысить качество решений и вычислительную эффективность по сравнению с прямыми или наивными методами, особенно на задачах большой размерности и с несколькими депо.</w:t>
+        <w:t xml:space="preserve">редполагается, что </w:t>
+      </w:r>
+      <w:r>
+        <w:rPr>
+          <w:rFonts w:ascii="Times New Roman" w:hAnsi="Times New Roman" w:cs="Times New Roman"/>
+          <w:sz w:val="28"/>
+          <w:szCs w:val="28"/>
+        </w:rPr>
+        <w:t>MDMTSP</w:t>
+      </w:r>
+      <w:r>
+        <w:rPr>
+          <w:rFonts w:ascii="Times New Roman" w:hAnsi="Times New Roman" w:cs="Times New Roman"/>
+          <w:sz w:val="28"/>
+          <w:szCs w:val="28"/>
+          <w:lang w:val="ru-RU"/>
+        </w:rPr>
+        <w:t xml:space="preserve"> можно решать эффективнее, если сначала распределять клиентов между депо и агентами, затем строить маршруты внутри групп, а после этого улучшать решение межмаршрутными эвристиками (переносы, перестановки, локальный поиск). Ожидается, что такая комбинация даст более стабильный и выгодный компромисс между качеством решения и временем расчёта, особенно на крупных инстансах и в многодепо сценариях, по сравнению с простыми базовыми или стандартными конфигурациями универсальных решателей.</w:t>
       </w:r>
     </w:p>
     <w:p>
@@ -1354,7 +1533,39 @@
                 <w:b/>
                 <w:spacing w:val="-2"/>
               </w:rPr>
-              <w:t>11.02.2026–17.03.2026</w:t>
+              <w:t>11.02.2026–</w:t>
+            </w:r>
+            <w:r>
+              <w:rPr>
+                <w:rFonts w:ascii="Times New Roman" w:hAnsi="Times New Roman" w:cs="Times New Roman"/>
+                <w:b/>
+                <w:spacing w:val="-2"/>
+              </w:rPr>
+              <w:t>24</w:t>
+            </w:r>
+            <w:r>
+              <w:rPr>
+                <w:rFonts w:ascii="Times New Roman" w:hAnsi="Times New Roman" w:cs="Times New Roman"/>
+                <w:b/>
+                <w:spacing w:val="-2"/>
+              </w:rPr>
+              <w:t>.0</w:t>
+            </w:r>
+            <w:r>
+              <w:rPr>
+                <w:rFonts w:ascii="Times New Roman" w:hAnsi="Times New Roman" w:cs="Times New Roman"/>
+                <w:b/>
+                <w:spacing w:val="-2"/>
+              </w:rPr>
+              <w:t>2</w:t>
+            </w:r>
+            <w:r>
+              <w:rPr>
+                <w:rFonts w:ascii="Times New Roman" w:hAnsi="Times New Roman" w:cs="Times New Roman"/>
+                <w:b/>
+                <w:spacing w:val="-2"/>
+              </w:rPr>
+              <w:t>.2026</w:t>
             </w:r>
           </w:p>
           <w:p>
@@ -1450,7 +1661,63 @@
                 <w:b/>
                 <w:spacing w:val="-2"/>
               </w:rPr>
-              <w:t>18.03.2026–07.04.2026</w:t>
+              <w:t>25.</w:t>
+            </w:r>
+            <w:r>
+              <w:rPr>
+                <w:rFonts w:ascii="Times New Roman" w:hAnsi="Times New Roman" w:cs="Times New Roman"/>
+                <w:b/>
+                <w:spacing w:val="-2"/>
+              </w:rPr>
+              <w:t>0</w:t>
+            </w:r>
+            <w:r>
+              <w:rPr>
+                <w:rFonts w:ascii="Times New Roman" w:hAnsi="Times New Roman" w:cs="Times New Roman"/>
+                <w:b/>
+                <w:spacing w:val="-2"/>
+              </w:rPr>
+              <w:t>2</w:t>
+            </w:r>
+            <w:r>
+              <w:rPr>
+                <w:rFonts w:ascii="Times New Roman" w:hAnsi="Times New Roman" w:cs="Times New Roman"/>
+                <w:b/>
+                <w:spacing w:val="-2"/>
+              </w:rPr>
+              <w:t>.2026–</w:t>
+            </w:r>
+            <w:r>
+              <w:rPr>
+                <w:rFonts w:ascii="Times New Roman" w:hAnsi="Times New Roman" w:cs="Times New Roman"/>
+                <w:b/>
+                <w:spacing w:val="-2"/>
+              </w:rPr>
+              <w:t>28</w:t>
+            </w:r>
+            <w:r>
+              <w:rPr>
+                <w:rFonts w:ascii="Times New Roman" w:hAnsi="Times New Roman" w:cs="Times New Roman"/>
+                <w:b/>
+                <w:spacing w:val="-2"/>
+              </w:rPr>
+              <w:t>.0</w:t>
+            </w:r>
+            <w:r>
+              <w:rPr>
+                <w:rFonts w:ascii="Times New Roman" w:hAnsi="Times New Roman" w:cs="Times New Roman"/>
+                <w:b/>
+                <w:spacing w:val="-2"/>
+              </w:rPr>
+              <w:t>2</w:t>
+            </w:r>
+            <w:r>
+              <w:rPr>
+                <w:rFonts w:ascii="Times New Roman" w:hAnsi="Times New Roman" w:cs="Times New Roman"/>
+                <w:b/>
+                <w:spacing w:val="-2"/>
+              </w:rPr>
+              <w:t>.2026</w:t>
             </w:r>
           </w:p>
           <w:p>
@@ -1570,7 +1837,63 @@
                 <w:b/>
                 <w:spacing w:val="-2"/>
               </w:rPr>
-              <w:t>08.04.2026–05.05.2026</w:t>
+              <w:t>01</w:t>
+            </w:r>
+            <w:r>
+              <w:rPr>
+                <w:rFonts w:ascii="Times New Roman" w:hAnsi="Times New Roman" w:cs="Times New Roman"/>
+                <w:b/>
+                <w:spacing w:val="-2"/>
+              </w:rPr>
+              <w:t>.0</w:t>
+            </w:r>
+            <w:r>
+              <w:rPr>
+                <w:rFonts w:ascii="Times New Roman" w:hAnsi="Times New Roman" w:cs="Times New Roman"/>
+                <w:b/>
+                <w:spacing w:val="-2"/>
+              </w:rPr>
+              <w:t>3</w:t>
+            </w:r>
+            <w:r>
+              <w:rPr>
+                <w:rFonts w:ascii="Times New Roman" w:hAnsi="Times New Roman" w:cs="Times New Roman"/>
+                <w:b/>
+                <w:spacing w:val="-2"/>
+              </w:rPr>
+              <w:t>.2026–</w:t>
+            </w:r>
+            <w:r>
+              <w:rPr>
+                <w:rFonts w:ascii="Times New Roman" w:hAnsi="Times New Roman" w:cs="Times New Roman"/>
+                <w:b/>
+                <w:spacing w:val="-2"/>
+              </w:rPr>
+              <w:t>14</w:t>
+            </w:r>
+            <w:r>
+              <w:rPr>
+                <w:rFonts w:ascii="Times New Roman" w:hAnsi="Times New Roman" w:cs="Times New Roman"/>
+                <w:b/>
+                <w:spacing w:val="-2"/>
+              </w:rPr>
+              <w:t>.0</w:t>
+            </w:r>
+            <w:r>
+              <w:rPr>
+                <w:rFonts w:ascii="Times New Roman" w:hAnsi="Times New Roman" w:cs="Times New Roman"/>
+                <w:b/>
+                <w:spacing w:val="-2"/>
+              </w:rPr>
+              <w:t>3</w:t>
+            </w:r>
+            <w:r>
+              <w:rPr>
+                <w:rFonts w:ascii="Times New Roman" w:hAnsi="Times New Roman" w:cs="Times New Roman"/>
+                <w:b/>
+                <w:spacing w:val="-2"/>
+              </w:rPr>
+              <w:t>.2026</w:t>
             </w:r>
           </w:p>
           <w:p>
@@ -1685,7 +2008,63 @@
                 <w:b/>
                 <w:spacing w:val="-2"/>
               </w:rPr>
-              <w:t>06.05.2026–25.05.2026</w:t>
+              <w:t>15</w:t>
+            </w:r>
+            <w:r>
+              <w:rPr>
+                <w:rFonts w:ascii="Times New Roman" w:hAnsi="Times New Roman" w:cs="Times New Roman"/>
+                <w:b/>
+                <w:spacing w:val="-2"/>
+              </w:rPr>
+              <w:t>.0</w:t>
+            </w:r>
+            <w:r>
+              <w:rPr>
+                <w:rFonts w:ascii="Times New Roman" w:hAnsi="Times New Roman" w:cs="Times New Roman"/>
+                <w:b/>
+                <w:spacing w:val="-2"/>
+              </w:rPr>
+              <w:t>3</w:t>
+            </w:r>
+            <w:r>
+              <w:rPr>
+                <w:rFonts w:ascii="Times New Roman" w:hAnsi="Times New Roman" w:cs="Times New Roman"/>
+                <w:b/>
+                <w:spacing w:val="-2"/>
+              </w:rPr>
+              <w:t>.2026–2</w:t>
+            </w:r>
+            <w:r>
+              <w:rPr>
+                <w:rFonts w:ascii="Times New Roman" w:hAnsi="Times New Roman" w:cs="Times New Roman"/>
+                <w:b/>
+                <w:spacing w:val="-2"/>
+              </w:rPr>
+              <w:t>7</w:t>
+            </w:r>
+            <w:r>
+              <w:rPr>
+                <w:rFonts w:ascii="Times New Roman" w:hAnsi="Times New Roman" w:cs="Times New Roman"/>
+                <w:b/>
+                <w:spacing w:val="-2"/>
+              </w:rPr>
+              <w:t>.0</w:t>
+            </w:r>
+            <w:r>
+              <w:rPr>
+                <w:rFonts w:ascii="Times New Roman" w:hAnsi="Times New Roman" w:cs="Times New Roman"/>
+                <w:b/>
+                <w:spacing w:val="-2"/>
+              </w:rPr>
+              <w:t>3</w:t>
+            </w:r>
+            <w:r>
+              <w:rPr>
+                <w:rFonts w:ascii="Times New Roman" w:hAnsi="Times New Roman" w:cs="Times New Roman"/>
+                <w:b/>
+                <w:spacing w:val="-2"/>
+              </w:rPr>
+              <w:t>.2026</w:t>
             </w:r>
           </w:p>
         </w:tc>
@@ -1770,7 +2149,7 @@
         </w:trPr>
         <w:tc>
           <w:tcPr>
-            <w:tcW w:w="4320" w:type="dxa"/>
+            <w:tcW w:w="4448" w:type="dxa"/>
             <w:tcBorders>
               <w:top w:val="single" w:sz="4" w:space="0" w:color="auto"/>
               <w:left w:val="single" w:sz="4" w:space="0" w:color="auto"/>
@@ -1799,7 +2178,7 @@
         </w:tc>
         <w:tc>
           <w:tcPr>
-            <w:tcW w:w="4320" w:type="dxa"/>
+            <w:tcW w:w="4449" w:type="dxa"/>
             <w:tcBorders>
               <w:top w:val="single" w:sz="4" w:space="0" w:color="auto"/>
               <w:left w:val="single" w:sz="4" w:space="0" w:color="auto"/>
@@ -1834,7 +2213,7 @@
         </w:trPr>
         <w:tc>
           <w:tcPr>
-            <w:tcW w:w="4320" w:type="dxa"/>
+            <w:tcW w:w="4448" w:type="dxa"/>
             <w:tcBorders>
               <w:top w:val="single" w:sz="4" w:space="0" w:color="auto"/>
               <w:left w:val="single" w:sz="4" w:space="0" w:color="auto"/>
@@ -1859,7 +2238,7 @@
         </w:tc>
         <w:tc>
           <w:tcPr>
-            <w:tcW w:w="4320" w:type="dxa"/>
+            <w:tcW w:w="4449" w:type="dxa"/>
             <w:tcBorders>
               <w:top w:val="single" w:sz="4" w:space="0" w:color="auto"/>
               <w:left w:val="single" w:sz="4" w:space="0" w:color="auto"/>
@@ -1892,7 +2271,7 @@
         </w:trPr>
         <w:tc>
           <w:tcPr>
-            <w:tcW w:w="4320" w:type="dxa"/>
+            <w:tcW w:w="4448" w:type="dxa"/>
             <w:tcBorders>
               <w:top w:val="single" w:sz="4" w:space="0" w:color="auto"/>
               <w:left w:val="single" w:sz="4" w:space="0" w:color="auto"/>
@@ -1911,71 +2290,13 @@
               <w:rPr>
                 <w:rFonts w:ascii="Times New Roman" w:hAnsi="Times New Roman" w:cs="Times New Roman"/>
               </w:rPr>
-              <w:t>Качество обзора литературы</w:t>
-            </w:r>
-          </w:p>
-        </w:tc>
-        <w:tc>
-          <w:tcPr>
-            <w:tcW w:w="4320" w:type="dxa"/>
-            <w:tcBorders>
-              <w:top w:val="single" w:sz="4" w:space="0" w:color="auto"/>
-              <w:left w:val="single" w:sz="4" w:space="0" w:color="auto"/>
-              <w:bottom w:val="single" w:sz="4" w:space="0" w:color="auto"/>
-              <w:right w:val="single" w:sz="4" w:space="0" w:color="auto"/>
-            </w:tcBorders>
-          </w:tcPr>
-          <w:p>
-            <w:pPr>
-              <w:spacing w:after="0" w:line="240" w:lineRule="auto"/>
-              <w:rPr>
-                <w:rFonts w:ascii="Times New Roman" w:hAnsi="Times New Roman" w:cs="Times New Roman"/>
-                <w:lang w:val="ru-RU"/>
-              </w:rPr>
-            </w:pPr>
-            <w:r>
-              <w:rPr>
-                <w:rFonts w:ascii="Times New Roman" w:hAnsi="Times New Roman" w:cs="Times New Roman"/>
-                <w:lang w:val="ru-RU"/>
-              </w:rPr>
-              <w:t>Глубина анализа предшествующих работ по теме проекта</w:t>
-            </w:r>
-          </w:p>
-        </w:tc>
-      </w:tr>
-      <w:tr>
-        <w:trPr>
-          <w:cantSplit/>
-          <w:jc w:val="center"/>
-        </w:trPr>
-        <w:tc>
-          <w:tcPr>
-            <w:tcW w:w="4320" w:type="dxa"/>
-            <w:tcBorders>
-              <w:top w:val="single" w:sz="4" w:space="0" w:color="auto"/>
-              <w:left w:val="single" w:sz="4" w:space="0" w:color="auto"/>
-              <w:bottom w:val="single" w:sz="4" w:space="0" w:color="auto"/>
-              <w:right w:val="single" w:sz="4" w:space="0" w:color="auto"/>
-            </w:tcBorders>
-          </w:tcPr>
-          <w:p>
-            <w:pPr>
-              <w:spacing w:after="0" w:line="240" w:lineRule="auto"/>
-              <w:rPr>
-                <w:rFonts w:ascii="Times New Roman" w:hAnsi="Times New Roman" w:cs="Times New Roman"/>
-              </w:rPr>
-            </w:pPr>
-            <w:r>
-              <w:rPr>
-                <w:rFonts w:ascii="Times New Roman" w:hAnsi="Times New Roman" w:cs="Times New Roman"/>
-              </w:rPr>
               <w:t>Корректность теоретических решений</w:t>
             </w:r>
           </w:p>
         </w:tc>
         <w:tc>
           <w:tcPr>
-            <w:tcW w:w="4320" w:type="dxa"/>
+            <w:tcW w:w="4449" w:type="dxa"/>
             <w:tcBorders>
               <w:top w:val="single" w:sz="4" w:space="0" w:color="auto"/>
               <w:left w:val="single" w:sz="4" w:space="0" w:color="auto"/>
@@ -2008,7 +2329,7 @@
         </w:trPr>
         <w:tc>
           <w:tcPr>
-            <w:tcW w:w="4320" w:type="dxa"/>
+            <w:tcW w:w="4448" w:type="dxa"/>
             <w:tcBorders>
               <w:top w:val="single" w:sz="4" w:space="0" w:color="auto"/>
               <w:left w:val="single" w:sz="4" w:space="0" w:color="auto"/>
@@ -2033,7 +2354,7 @@
         </w:tc>
         <w:tc>
           <w:tcPr>
-            <w:tcW w:w="4320" w:type="dxa"/>
+            <w:tcW w:w="4449" w:type="dxa"/>
             <w:tcBorders>
               <w:top w:val="single" w:sz="4" w:space="0" w:color="auto"/>
               <w:left w:val="single" w:sz="4" w:space="0" w:color="auto"/>
@@ -2066,7 +2387,7 @@
         </w:trPr>
         <w:tc>
           <w:tcPr>
-            <w:tcW w:w="4320" w:type="dxa"/>
+            <w:tcW w:w="4448" w:type="dxa"/>
             <w:tcBorders>
               <w:top w:val="single" w:sz="4" w:space="0" w:color="auto"/>
               <w:left w:val="single" w:sz="4" w:space="0" w:color="auto"/>
@@ -2091,7 +2412,7 @@
         </w:tc>
         <w:tc>
           <w:tcPr>
-            <w:tcW w:w="4320" w:type="dxa"/>
+            <w:tcW w:w="4449" w:type="dxa"/>
             <w:tcBorders>
               <w:top w:val="single" w:sz="4" w:space="0" w:color="auto"/>
               <w:left w:val="single" w:sz="4" w:space="0" w:color="auto"/>
@@ -2124,7 +2445,7 @@
         </w:trPr>
         <w:tc>
           <w:tcPr>
-            <w:tcW w:w="4320" w:type="dxa"/>
+            <w:tcW w:w="4448" w:type="dxa"/>
             <w:tcBorders>
               <w:top w:val="single" w:sz="4" w:space="0" w:color="auto"/>
               <w:left w:val="single" w:sz="4" w:space="0" w:color="auto"/>
@@ -2149,7 +2470,7 @@
         </w:tc>
         <w:tc>
           <w:tcPr>
-            <w:tcW w:w="4320" w:type="dxa"/>
+            <w:tcW w:w="4449" w:type="dxa"/>
             <w:tcBorders>
               <w:top w:val="single" w:sz="4" w:space="0" w:color="auto"/>
               <w:left w:val="single" w:sz="4" w:space="0" w:color="auto"/>
@@ -2171,65 +2492,6 @@
                 <w:lang w:val="ru-RU"/>
               </w:rPr>
               <w:t>Грамотность, чёткость и полнота представления результатов</w:t>
-            </w:r>
-          </w:p>
-        </w:tc>
-      </w:tr>
-      <w:tr>
-        <w:trPr>
-          <w:cantSplit/>
-          <w:trHeight w:val="493"/>
-          <w:jc w:val="center"/>
-        </w:trPr>
-        <w:tc>
-          <w:tcPr>
-            <w:tcW w:w="4320" w:type="dxa"/>
-            <w:tcBorders>
-              <w:top w:val="single" w:sz="4" w:space="0" w:color="auto"/>
-              <w:left w:val="single" w:sz="4" w:space="0" w:color="auto"/>
-              <w:bottom w:val="single" w:sz="4" w:space="0" w:color="auto"/>
-              <w:right w:val="single" w:sz="4" w:space="0" w:color="auto"/>
-            </w:tcBorders>
-          </w:tcPr>
-          <w:p>
-            <w:pPr>
-              <w:spacing w:after="0" w:line="240" w:lineRule="auto"/>
-              <w:rPr>
-                <w:rFonts w:ascii="Times New Roman" w:hAnsi="Times New Roman" w:cs="Times New Roman"/>
-              </w:rPr>
-            </w:pPr>
-            <w:r>
-              <w:rPr>
-                <w:rFonts w:ascii="Times New Roman" w:hAnsi="Times New Roman" w:cs="Times New Roman"/>
-              </w:rPr>
-              <w:t>Соблюдение сроков выполнения</w:t>
-            </w:r>
-          </w:p>
-        </w:tc>
-        <w:tc>
-          <w:tcPr>
-            <w:tcW w:w="4320" w:type="dxa"/>
-            <w:tcBorders>
-              <w:top w:val="single" w:sz="4" w:space="0" w:color="auto"/>
-              <w:left w:val="single" w:sz="4" w:space="0" w:color="auto"/>
-              <w:bottom w:val="single" w:sz="4" w:space="0" w:color="auto"/>
-              <w:right w:val="single" w:sz="4" w:space="0" w:color="auto"/>
-            </w:tcBorders>
-          </w:tcPr>
-          <w:p>
-            <w:pPr>
-              <w:spacing w:after="0" w:line="240" w:lineRule="auto"/>
-              <w:rPr>
-                <w:rFonts w:ascii="Times New Roman" w:hAnsi="Times New Roman" w:cs="Times New Roman"/>
-                <w:lang w:val="ru-RU"/>
-              </w:rPr>
-            </w:pPr>
-            <w:r>
-              <w:rPr>
-                <w:rFonts w:ascii="Times New Roman" w:hAnsi="Times New Roman" w:cs="Times New Roman"/>
-                <w:lang w:val="ru-RU"/>
-              </w:rPr>
-              <w:t>Выполнение плана по этапам проекта</w:t>
             </w:r>
           </w:p>
         </w:tc>
@@ -2244,25 +2506,6 @@
           <w:lang w:val="ru-RU"/>
         </w:rPr>
       </w:pPr>
-    </w:p>
-    <w:p>
-      <w:pPr>
-        <w:rPr>
-          <w:rFonts w:ascii="Times New Roman" w:hAnsi="Times New Roman" w:cs="Times New Roman"/>
-          <w:sz w:val="28"/>
-          <w:szCs w:val="28"/>
-          <w:lang w:val="ru-RU"/>
-        </w:rPr>
-      </w:pPr>
-      <w:r>
-        <w:rPr>
-          <w:rFonts w:ascii="Times New Roman" w:hAnsi="Times New Roman" w:cs="Times New Roman"/>
-          <w:sz w:val="28"/>
-          <w:szCs w:val="28"/>
-          <w:lang w:val="ru-RU"/>
-        </w:rPr>
-        <w:t xml:space="preserve"> </w:t>
-      </w:r>
     </w:p>
     <w:p>
       <w:pPr>
@@ -2290,15 +2533,27 @@
     </w:p>
     <w:p>
       <w:pPr>
-        <w:spacing w:before="100" w:beforeAutospacing="1" w:after="100" w:afterAutospacing="1" w:line="240" w:lineRule="auto"/>
         <w:jc w:val="both"/>
         <w:rPr>
           <w:rFonts w:ascii="Times New Roman" w:hAnsi="Times New Roman" w:cs="Times New Roman"/>
+          <w:b/>
+          <w:bCs/>
           <w:sz w:val="28"/>
           <w:szCs w:val="28"/>
           <w:lang w:val="ru-RU"/>
         </w:rPr>
       </w:pPr>
+      <w:r>
+        <w:rPr>
+          <w:rFonts w:ascii="Times New Roman" w:hAnsi="Times New Roman" w:cs="Times New Roman"/>
+          <w:b/>
+          <w:bCs/>
+          <w:sz w:val="28"/>
+          <w:szCs w:val="28"/>
+          <w:lang w:val="ru-RU"/>
+        </w:rPr>
+        <w:t xml:space="preserve">3.1. </w:t>
+      </w:r>
       <w:r>
         <w:rPr>
           <w:rFonts w:ascii="Times New Roman" w:hAnsi="Times New Roman" w:cs="Times New Roman"/>
@@ -2362,28 +2617,41 @@
     </w:p>
     <w:p>
       <w:pPr>
-        <w:spacing w:before="100" w:beforeAutospacing="1" w:after="100" w:afterAutospacing="1" w:line="240" w:lineRule="auto"/>
+        <w:pStyle w:val="aff8"/>
         <w:jc w:val="both"/>
         <w:rPr>
-          <w:rFonts w:ascii="Times New Roman" w:hAnsi="Times New Roman" w:cs="Times New Roman"/>
+          <w:rFonts w:eastAsia="Times New Roman"/>
+          <w:lang w:val="ru-RU" w:eastAsia="ru-RU"/>
+        </w:rPr>
+      </w:pPr>
+      <w:r>
+        <w:rPr>
+          <w:b/>
+          <w:bCs/>
           <w:sz w:val="28"/>
           <w:szCs w:val="28"/>
           <w:lang w:val="ru-RU"/>
         </w:rPr>
-      </w:pPr>
+        <w:t>3.2.</w:t>
+      </w:r>
       <w:r>
         <w:rPr>
-          <w:rFonts w:ascii="Times New Roman" w:hAnsi="Times New Roman" w:cs="Times New Roman"/>
           <w:sz w:val="28"/>
           <w:szCs w:val="28"/>
           <w:lang w:val="ru-RU"/>
         </w:rPr>
-        <w:lastRenderedPageBreak/>
+        <w:t xml:space="preserve"> </w:t>
+      </w:r>
+      <w:r>
+        <w:rPr>
+          <w:sz w:val="28"/>
+          <w:szCs w:val="28"/>
+          <w:lang w:val="ru-RU"/>
+        </w:rPr>
         <w:t xml:space="preserve">Рассматриваемая задача </w:t>
       </w:r>
       <w:r>
         <w:rPr>
-          <w:rFonts w:ascii="Times New Roman" w:hAnsi="Times New Roman" w:cs="Times New Roman"/>
           <w:sz w:val="28"/>
           <w:szCs w:val="28"/>
         </w:rPr>
@@ -2391,7 +2659,6 @@
       </w:r>
       <w:r>
         <w:rPr>
-          <w:rFonts w:ascii="Times New Roman" w:hAnsi="Times New Roman" w:cs="Times New Roman"/>
           <w:sz w:val="28"/>
           <w:szCs w:val="28"/>
           <w:lang w:val="ru-RU"/>
@@ -2400,7 +2667,6 @@
       </w:r>
       <w:r>
         <w:rPr>
-          <w:rFonts w:ascii="Times New Roman" w:hAnsi="Times New Roman" w:cs="Times New Roman"/>
           <w:sz w:val="28"/>
           <w:szCs w:val="28"/>
         </w:rPr>
@@ -2408,12 +2674,72 @@
       </w:r>
       <w:r>
         <w:rPr>
-          <w:rFonts w:ascii="Times New Roman" w:hAnsi="Times New Roman" w:cs="Times New Roman"/>
           <w:sz w:val="28"/>
           <w:szCs w:val="28"/>
           <w:lang w:val="ru-RU"/>
         </w:rPr>
-        <w:t>-трудных) задач, в связи с чем в исследовании приоритет отдается эвристическим и приближённым методам, ориентированным на получение качественных решений за ограниченное время. Точные алгоритмы рассматриваются лишь в вспомогательной роли — преимущественно для малых по размеру инстансов или в качестве ориентиров при оценке качества решений. Одним из ключевых ограничений проекта является возможный резкий рост вычислительных затрат при увеличении числа депо, агентов и обслуживаемых вершин, что может существенно осложнять проведение масштабных вычислительных экспериментов. В этой связи в работе вводятся ограничения на вычислительный бюджет (по времени и/или числу итераций), а также применяется структурированный подбор тестовых наборов, охватывающих малые, средние и крупные сценарии, с контролем числа прогонов.</w:t>
+        <w:t xml:space="preserve">-трудных) задач, в связи с чем в исследовании приоритет отдается эвристическим и приближённым </w:t>
+      </w:r>
+      <w:r>
+        <w:rPr>
+          <w:sz w:val="28"/>
+          <w:szCs w:val="28"/>
+          <w:lang w:val="ru-RU"/>
+        </w:rPr>
+        <w:lastRenderedPageBreak/>
+        <w:t xml:space="preserve">методам, ориентированным на получение качественных решений за ограниченное время. </w:t>
+      </w:r>
+      <w:r>
+        <w:rPr>
+          <w:rFonts w:eastAsia="Times New Roman"/>
+          <w:sz w:val="28"/>
+          <w:szCs w:val="28"/>
+          <w:lang w:val="ru-RU" w:eastAsia="ru-RU"/>
+        </w:rPr>
+        <w:t>Точные алгоритмы рассматриваются лишь в вспомогательной роли и применяются в основном для малых по размеру инстансов или как ориентир при оценке качества полученных решений.</w:t>
+      </w:r>
+      <w:r>
+        <w:rPr>
+          <w:rFonts w:eastAsia="Times New Roman"/>
+          <w:lang w:val="ru-RU" w:eastAsia="ru-RU"/>
+        </w:rPr>
+        <w:t xml:space="preserve"> </w:t>
+      </w:r>
+    </w:p>
+    <w:p>
+      <w:pPr>
+        <w:pStyle w:val="aff8"/>
+        <w:jc w:val="both"/>
+        <w:rPr>
+          <w:rFonts w:eastAsia="Times New Roman"/>
+          <w:lang w:val="ru-RU" w:eastAsia="ru-RU"/>
+        </w:rPr>
+      </w:pPr>
+      <w:r>
+        <w:rPr>
+          <w:b/>
+          <w:bCs/>
+          <w:sz w:val="28"/>
+          <w:szCs w:val="28"/>
+          <w:lang w:val="ru-RU"/>
+        </w:rPr>
+        <w:t>3.3.</w:t>
+      </w:r>
+      <w:r>
+        <w:rPr>
+          <w:sz w:val="28"/>
+          <w:szCs w:val="28"/>
+          <w:lang w:val="ru-RU"/>
+        </w:rPr>
+        <w:t xml:space="preserve"> </w:t>
+      </w:r>
+      <w:r>
+        <w:rPr>
+          <w:sz w:val="28"/>
+          <w:szCs w:val="28"/>
+          <w:lang w:val="ru-RU"/>
+        </w:rPr>
+        <w:t>Одним из ключевых ограничений проекта является возможный резкий рост вычислительных затрат при увеличении числа депо, агентов и обслуживаемых вершин, что может существенно осложнять проведение масштабных вычислительных экспериментов. В этой связи в работе вводятся ограничения на вычислительный бюджет (по времени и/или числу итераций), а также применяется структурированный подбор тестовых наборов, охватывающих малые, средние и крупные сценарии, с контролем числа прогонов.</w:t>
       </w:r>
     </w:p>
     <w:p>
@@ -2427,6 +2753,26 @@
           <w:lang w:val="ru-RU" w:eastAsia="ru-RU"/>
         </w:rPr>
       </w:pPr>
+      <w:r>
+        <w:rPr>
+          <w:rFonts w:ascii="Times New Roman" w:eastAsia="Times New Roman" w:hAnsi="Times New Roman" w:cs="Times New Roman"/>
+          <w:b/>
+          <w:bCs/>
+          <w:sz w:val="28"/>
+          <w:szCs w:val="28"/>
+          <w:lang w:val="ru-RU" w:eastAsia="ru-RU"/>
+        </w:rPr>
+        <w:t>3.4.</w:t>
+      </w:r>
+      <w:r>
+        <w:rPr>
+          <w:rFonts w:ascii="Times New Roman" w:eastAsia="Times New Roman" w:hAnsi="Times New Roman" w:cs="Times New Roman"/>
+          <w:sz w:val="28"/>
+          <w:szCs w:val="28"/>
+          <w:lang w:val="ru-RU" w:eastAsia="ru-RU"/>
+        </w:rPr>
+        <w:t xml:space="preserve"> </w:t>
+      </w:r>
       <w:r>
         <w:rPr>
           <w:rFonts w:ascii="Times New Roman" w:eastAsia="Times New Roman" w:hAnsi="Times New Roman" w:cs="Times New Roman"/>

</xml_diff>